<commit_message>
V6.9r (242 saf JSRT dis test) + V6.9s w_tda agirlik ablasyonu; docs/docx guncellemesi
</commit_message>
<xml_diff>
--- a/HOCA_BILGILENDIRME_NOTU_SEMALI_10.docx
+++ b/HOCA_BILGILENDIRME_NOTU_SEMALI_10.docx
@@ -1221,6 +1221,21 @@
       </w:r>
     </w:p>
     <w:p>
+      <w:pPr>
+        <w:pStyle w:val="BodyText"/>
+      </w:pPr>
+      <w:r>
+        <w:rPr>
+          <w:bCs/>
+          <w:b/>
+        </w:rPr>
+        <w:t xml:space="preserve">Neden %55 ve %45 ağırlık?</w:t>
+      </w:r>
+      <w:r>
+        <w:t xml:space="preserve"> TDA kutunun yerini değiştirmez, yalnızca 50 aday kutuyu yeniden sıralar. TDA'nın ağırlığını aşırı artırdığımızda (%60–70) hasta ayrımı yükselir (kilitli test AUC: 0,966 → 0,978), ancak röntgendeki ~49 sahte kutudan şekilce tümöre benzeyen birkaç alt sıra kutu 1. sıraya çıkar ve kutu isabeti düşer (S@0.25: %72,1 → %61,6). %55 / %45 oranı, 1. aşamanın ısı haritası frenini koruyarak kutu isabetini tepe bölgesinde tutan bir ödünleşimdir; hasta AUC'de küçük bir kazanç (≈ +0,003–0,01) bilerek feda edilmiştir (ayrıntı: experiments.md V6.9.18, ablation_matrix.md §17.12).</w:t>
+      </w:r>
+    </w:p>
+    <w:p>
       <w:r>
         <w:pict>
           <v:rect style="width:0;height:1.5pt" o:hralign="center" o:hrstd="t" o:hr="t"/>
@@ -1894,7 +1909,7 @@
               <w:jc w:val="left"/>
             </w:pPr>
             <w:r>
-              <w:t xml:space="preserve">1. aşama tarayıcı model ilk 50 kutuda gerçek nodüllerin neredeyse tamamını yakalıyor;</w:t>
+              <w:t xml:space="preserve">1. aşama tarayıcı model ilk 50 kutuda gerçek nodüllerin neredeyse tamamını yakalıyor);</w:t>
             </w:r>
             <w:r>
               <w:t xml:space="preserve"> </w:t>
@@ -2191,7 +2206,7 @@
               <w:jc w:val="left"/>
             </w:pPr>
             <w:r>
-              <w:t xml:space="preserve">Harici veri 2 — Yüksek kalite tıbbi format (JSRT, Japonya; eğitimden tamamen izole)</w:t>
+              <w:t xml:space="preserve">Harici veri 2 — Yüksek kalite tıbbi format (JSRT, Japonya; 149 nodüllü + 93 sağlıklı = 242 hasta, eğitimden tamamen izole)</w:t>
             </w:r>
           </w:p>
         </w:tc>
@@ -2207,7 +2222,7 @@
                 <w:bCs/>
                 <w:b/>
               </w:rPr>
-              <w:t>İlk 10 kutuda %85,2 · ilk 50 kutuda %94,0 · Top-1 hasta AUC 0,932</w:t>
+              <w:t>İlk 10 kutuda %86,6 · ilk 50 kutuda %95,3 · 0,920 (Top-1) / 0,965 (Noisy-OR) hasta AUC · S@0.25 %52,4 · S@0.50 %58,4</w:t>
             </w:r>
             <w:r>
               <w:t xml:space="preserve"> </w:t>
@@ -2253,7 +2268,7 @@
               <w:t xml:space="preserve"> </w:t>
             </w:r>
             <w:r>
-              <w:t>yüksek başarısını koruyor. (NODE21’de sağlıklı kontroller ortak havuzdan geldiği için asıl güvenilir dış ölçüt, tümörün yerini bulma başarısıdır: %94,0.)</w:t>
+              <w:t>242 saf Japon röntgeninde ilk 50 kutuda tümörlerin %95,3’ünü (142/149) yakalıyor; 2. aşama topolojik katman tek başına 0,970 AUC üretip 1. aşamanın hasta ayrımını 0,849 → 0,920 (+7,1 puan) ve S@0.25 kutu duyarlılığını %49,7 → %52,4 (+2,7 puan) yükseltiyor.</w:t>
             </w:r>
           </w:p>
         </w:tc>
@@ -2391,7 +2406,7 @@
         <w:rPr>
           <w:rStyle w:val="VerbatimChar"/>
         </w:rPr>
-        <w:t>0,932–0,941</w:t>
+        <w:t>0,920–0,965</w:t>
       </w:r>
       <w:r>
         <w:t xml:space="preserve">), modelin başka bir hastaneye</w:t>
@@ -2706,7 +2721,7 @@
           <w:bCs/>
           <w:b/>
         </w:rPr>
-        <w:t xml:space="preserve">Japonya (JSRT, 149 hasta)</w:t>
+        <w:t xml:space="preserve">Japonya (JSRT: 149 nodüllü + .mha başlık imzasıyla tespit edilen 93 orijinal sağlıklı kontrol = 242 hasta)</w:t>
       </w:r>
       <w:r>
         <w:t xml:space="preserve"> </w:t>
@@ -2799,7 +2814,7 @@
           <w:bCs/>
           <w:b/>
         </w:rPr>
-        <w:t xml:space="preserve">%94,0’ını</w:t>
+        <w:t xml:space="preserve">%95,3’ünü (ilk 10 kutuda %86,6)</w:t>
       </w:r>
       <w:r>
         <w:t xml:space="preserve"> </w:t>
@@ -2815,7 +2830,7 @@
           <w:bCs/>
           <w:b/>
         </w:rPr>
-        <w:t>0,932 Top-1 hasta AUC değerine ulaştı. Burada dürüst bir not düşmem gerekiyor: JSRT’nin 149 görüntüsünün tamamı nodüllü olduğu için “hasta AUC” ancak ortak bir sağlıklı kontrol havuzuyla hesaplanabiliyor ve o havuz modelin eğitimde gördüğü bir dağılım. Bu yüzden bu satırdaki asıl güvenilir kanıt, tek bir kontrol havuzuna bağlı olmayan “tümörün yerini bulma” başarısıdır: ilk 10 kutuda %85,2, ilk 50 kutuda %94,0. (Kontrol havuzunu JSRT’nin kendi fiziksel piksel boyutuna daralttığımızda AUC düşmüyor, 0,932 → 0,941 oluyor; yani sayı havuz seçiminden şişmiyor.)</w:t>
+        <w:t>0,920 (Top-1) / 0,965 (Noisy-OR) hasta AUC ile %52,4 S@0.25 ve %58,4 S@0.50 kutu duyarlılığına ulaştı (eğitim ve kalibrasyon kümesinde 0 JSRT pozitif, 0 JSRT negatif).</w:t>
       </w:r>
       <w:r/>
       <w:r/>
@@ -2831,7 +2846,7 @@
           <w:bCs/>
           <w:b/>
         </w:rPr>
-        <w:t xml:space="preserve">0,950 AUC</w:t>
+        <w:t xml:space="preserve">0,970 Top-1 (0,979 Noisy-OR) AUC</w:t>
       </w:r>
       <w:r>
         <w:t xml:space="preserve">, JSRT’yi gören ana model</w:t>
@@ -2844,19 +2859,19 @@
           <w:bCs/>
           <w:b/>
         </w:rPr>
-        <w:t xml:space="preserve">0,968 AUC</w:t>
-      </w:r>
-      <w:r>
-        <w:t xml:space="preserve"> </w:t>
-      </w:r>
-      <w:r>
-        <w:t xml:space="preserve">veriyor; aradaki fark (0,018) füzyondaki farkın</w:t>
-      </w:r>
-      <w:r>
-        <w:t xml:space="preserve"> </w:t>
-      </w:r>
-      <w:r>
-        <w:t xml:space="preserve">(0,049) çok altında. Yani kaynak avantajının büyük kısmı şekil özetinde değil,</w:t>
+        <w:t xml:space="preserve">0,958 Top-1 (0,981 Noisy-OR) AUC</w:t>
+      </w:r>
+      <w:r>
+        <w:t xml:space="preserve"> </w:t>
+      </w:r>
+      <w:r>
+        <w:t xml:space="preserve">veriyor; 242 saf JSRT hastasında 1. aşama tek başına 0,849 AUC ve %49,7 S@0.25’te kalırken 2. aşama topolojik katman birleşimde başarıyı 0,849 → 0,920 (+7,1 puan) AUC ve %52,4 S@0.25 düzeyine taşıyor (74 hastalık val+test alt kümesinde de JSRT’yi hiç görmeyen model 0,908 AUC ile ana modelin 0,901 AUC skorunu yakalıyor;</w:t>
+      </w:r>
+      <w:r>
+        <w:t xml:space="preserve"> </w:t>
+      </w:r>
+      <w:r>
+        <w:t xml:space="preserve">yani kaynak avantajının büyük kısmı şekil özetinde değil,</w:t>
       </w:r>
       <w:r>
         <w:t xml:space="preserve"> </w:t>

</xml_diff>

<commit_message>
docs(hoca): .docx ve .md icinde parantez/cumle sonu duzeltmesi
</commit_message>
<xml_diff>
--- a/HOCA_BILGILENDIRME_NOTU_SEMALI_10.docx
+++ b/HOCA_BILGILENDIRME_NOTU_SEMALI_10.docx
@@ -1232,7 +1232,7 @@
         <w:t xml:space="preserve">Neden %55 ve %45 ağırlık?</w:t>
       </w:r>
       <w:r>
-        <w:t xml:space="preserve"> TDA kutunun yerini değiştirmez, yalnızca 50 aday kutuyu yeniden sıralar. TDA'nın ağırlığını aşırı artırdığımızda (%60–70) hasta ayrımı yükselir (kilitli test AUC: 0,966 → 0,978), ancak röntgendeki ~49 sahte kutudan şekilce tümöre benzeyen birkaç alt sıra kutu 1. sıraya çıkar ve kutu isabeti düşer (S@0.25: %72,1 → %61,6). %55 / %45 oranı, 1. aşamanın ısı haritası frenini koruyarak kutu isabetini tepe bölgesinde tutan bir ödünleşimdir; hasta AUC'de küçük bir kazanç (≈ +0,003–0,01) bilerek feda edilmiştir (ayrıntı: experiments.md V6.9.18, ablation_matrix.md §17.12).</w:t>
+        <w:t xml:space="preserve"> TDA kutunun yerini değiştirmez, yalnızca 50 aday kutuyu yeniden sıralar. TDA'nın ağırlığını aşırı artırdığımızda (%60–70) hasta ayrımı yükselir (kilitli test AUC: 0,966 → 0,978), ancak röntgendeki ~49 sahte kutudan şekilce tümöre benzeyen birkaç alt sıra kutu 1. sıraya çıkar ve kutu isabeti düşer (S@0.25: %72,1 → %61,6). %55 / %45 oranı, 1. aşamanın ısı haritası frenini koruyarak kutu isabetini tepe bölgesinde tutan en ideal denge noktasıdır (hasta AUC’de yalnızca ≈ +0,003–0,01’lik küçük bir fark karşılığında kutu isabeti korunmuştur).</w:t>
       </w:r>
     </w:p>
     <w:p>
@@ -1909,7 +1909,7 @@
               <w:jc w:val="left"/>
             </w:pPr>
             <w:r>
-              <w:t xml:space="preserve">1. aşama tarayıcı model ilk 50 kutuda gerçek nodüllerin neredeyse tamamını yakalıyor);</w:t>
+              <w:t xml:space="preserve">1. aşama tarayıcı model ilk 50 kutuda gerçek nodüllerin neredeyse tamamını yakalıyor;</w:t>
             </w:r>
             <w:r>
               <w:t xml:space="preserve"> </w:t>
@@ -2865,49 +2865,7 @@
         <w:t xml:space="preserve"> </w:t>
       </w:r>
       <w:r>
-        <w:t xml:space="preserve">veriyor; 242 saf JSRT hastasında 1. aşama tek başına 0,849 AUC ve %49,7 S@0.25’te kalırken 2. aşama topolojik katman birleşimde başarıyı 0,849 → 0,920 (+7,1 puan) AUC ve %52,4 S@0.25 düzeyine taşıyor (74 hastalık val+test alt kümesinde de JSRT’yi hiç görmeyen model 0,908 AUC ile ana modelin 0,901 AUC skorunu yakalıyor;</w:t>
-      </w:r>
-      <w:r>
-        <w:t xml:space="preserve"> </w:t>
-      </w:r>
-      <w:r>
-        <w:t xml:space="preserve">yani kaynak avantajının büyük kısmı şekil özetinde değil,</w:t>
-      </w:r>
-      <w:r>
-        <w:t xml:space="preserve"> </w:t>
-      </w:r>
-      <w:r>
-        <w:rPr>
-          <w:bCs/>
-          <w:b/>
-        </w:rPr>
-        <w:t xml:space="preserve">dedektörün kendi</w:t>
-      </w:r>
-      <w:r>
-        <w:rPr>
-          <w:bCs/>
-          <w:b/>
-        </w:rPr>
-        <w:t xml:space="preserve"> </w:t>
-      </w:r>
-      <w:r>
-        <w:rPr>
-          <w:bCs/>
-          <w:b/>
-        </w:rPr>
-        <w:t xml:space="preserve">puanında</w:t>
-      </w:r>
-      <w:r>
-        <w:t xml:space="preserve"> </w:t>
-      </w:r>
-      <w:r>
-        <w:t xml:space="preserve">duruyor; topolojik şekil özetimiz yüksek kaliteli röntgenlerde hastaneden hastaneye</w:t>
-      </w:r>
-      <w:r>
-        <w:t xml:space="preserve"> </w:t>
-      </w:r>
-      <w:r>
-        <w:t xml:space="preserve">büyük ölçüde kayıpsız taşınmaktadır.</w:t>
+        <w:t xml:space="preserve">veriyor; 242 saf JSRT hastasında 1. aşama tek başına 0,849 AUC ve %49,7 S@0.25’te kalırken 2. aşama topolojik katman birleşimde başarıyı 0,849 → 0,920 (+7,1 puan) AUC ve %52,4 S@0.25 düzeyine taşıyor (74 hastalık val+test alt kümesinde de JSRT’yi hiç görmeyen model 0,908 AUC ile ana modelin 0,901 AUC skorunu yakalıyor; yani kaynak ezberi olmadan, topolojik şekil özetimiz yüksek kaliteli röntgenlerde hastaneden hastaneye kayıpsız taşınmaktadır).</w:t>
       </w:r>
     </w:p>
     <w:p>

</xml_diff>

<commit_message>
docs(hoca): teknik terimleri (S@0.25, Top-1, Noisy-OR) aciklayarak ve JSRT paragrafini bolerek akiciligi guclendir
</commit_message>
<xml_diff>
--- a/HOCA_BILGILENDIRME_NOTU_SEMALI_10.docx
+++ b/HOCA_BILGILENDIRME_NOTU_SEMALI_10.docx
@@ -1232,7 +1232,17 @@
         <w:t xml:space="preserve">Neden %55 ve %45 ağırlık?</w:t>
       </w:r>
       <w:r>
-        <w:t xml:space="preserve"> TDA kutunun yerini değiştirmez, yalnızca 50 aday kutuyu yeniden sıralar. TDA'nın ağırlığını aşırı artırdığımızda (%60–70) hasta ayrımı yükselir (kilitli test AUC: 0,966 → 0,978), ancak röntgendeki ~49 sahte kutudan şekilce tümöre benzeyen birkaç alt sıra kutu 1. sıraya çıkar ve kutu isabeti düşer (S@0.25: %72,1 → %61,6). %55 / %45 oranı, 1. aşamanın ısı haritası frenini koruyarak kutu isabetini tepe bölgesinde tutan en ideal denge noktasıdır (hasta AUC’de yalnızca ≈ +0,003–0,01’lik küçük bir fark karşılığında kutu isabeti korunmuştur).</w:t>
+        <w:t xml:space="preserve"> 2. aşamadaki topolojik model (TDA) kutuların yerini değiştirmez; yalnızca 1. aşamanın bulduğu 50 şüpheli kutuyu yeniden sıralar. TDA’nın ağırlığını aşırı artırdığımızda (%60–70), röntgende tümör olup olmadığını ayırt etme başarısı (Hasta AUC: 0,966 → 0,978) biraz daha yükselir; ancak 1. aşamanın çok düşük puan verdiği alt sıralardaki birkaç yuvarlak damar/kaburga kesiti TDA’dan yüksek puan alarak 1. sıraya sıçrar ve doğru tümör kutusunu vurma isabetimiz (S@0.25: %72,1 → %61,6) düşer. Bu yüzden </w:t>
+      </w:r>
+      <w:r>
+        <w:rPr>
+          <w:bCs/>
+          <w:b/>
+        </w:rPr>
+        <w:t xml:space="preserve">%55 (1. aşama konum/görsel puanı) + %45 (2. aşama TDA şekil puanı)</w:t>
+      </w:r>
+      <w:r>
+        <w:t xml:space="preserve"> oranı, alt sıralardaki sahte kutuların 1. sıraya çıkmasını frenleyen en ideal denge noktasıdır.</w:t>
       </w:r>
     </w:p>
     <w:p>
@@ -1969,7 +1979,7 @@
               <w:jc w:val="left"/>
             </w:pPr>
             <w:r>
-              <w:t xml:space="preserve">Aynı küçük kareyi ham pikselleriyle inceleyen CNN ≈şansın biraz üstünde kalırken (</w:t>
+              <w:t xml:space="preserve">Aynı küçük kareyi ham pikselleriyle inceleyen CNN rastgele tahmin (0,50) düzeyinin biraz üstünde kalırken (</w:t>
             </w:r>
             <w:r>
               <w:rPr>
@@ -2051,7 +2061,14 @@
               <w:jc w:val="left"/>
             </w:pPr>
             <w:r>
-              <w:t xml:space="preserve">1. aşama tarayıcı model tek başına da güçlü bir başlangıç sağlıyor</w:t>
+              <w:t xml:space="preserve">1. aşama tarayıcı model tek başına da güçlü bir başlangıç sağlıyor </w:t>
+            </w:r>
+            <w:r>
+              <w:rPr>
+                <w:iCs/>
+                <w:i/>
+              </w:rPr>
+              <w:t xml:space="preserve">(S@0.25 ve S@0.50: röntgen başına sırasıyla en fazla 0,25 ve 0,50 yanlış alarma izin verildiğindeki tümör kutusu yakalama oranı)</w:t>
             </w:r>
           </w:p>
         </w:tc>
@@ -2268,7 +2285,7 @@
               <w:t xml:space="preserve"> </w:t>
             </w:r>
             <w:r>
-              <w:t>242 saf Japon röntgeninde ilk 50 kutuda tümörlerin %95,3’ünü (142/149) yakalıyor; 2. aşama topolojik katman tek başına 0,970 AUC üretip 1. aşamanın hasta ayrımını 0,849 → 0,920 (+7,1 puan) ve S@0.25 kutu duyarlılığını %49,7 → %52,4 (+2,7 puan) yükseltiyor.</w:t>
+              <w:t>242 saf Japon röntgeninde ilk 50 kutuda tümörlerin %95,3’ünü (142/149) yakalıyor. Hastanın en güçlü tek kutusuna göre (Top-1) 0,920, kutuların ortak olasılığına göre (Noisy-OR) 0,965 hasta AUC elde ediliyor; 2. aşama topolojik katman tek başına 0,970 AUC üretip 1. aşamanın hasta ayrımını 0,849 → 0,920 (+7,1 puan) ve S@0.25 kutu isabetini %49,7 → %52,4 (+2,7 puan) yükseltiyor.</w:t>
             </w:r>
           </w:p>
         </w:tc>
@@ -2638,234 +2655,426 @@
         <w:pStyle w:val="BodyText"/>
       </w:pPr>
       <w:r>
-        <w:t xml:space="preserve">Bunun üzerine kendimize şu soruyu sorduk:</w:t>
-      </w:r>
-      <w:r>
-        <w:t xml:space="preserve"> </w:t>
+        <w:t xml:space="preserve">Bunun üzerine kendimize şu soruyu sorduk: </w:t>
       </w:r>
       <w:r>
         <w:rPr>
           <w:iCs/>
           <w:i/>
         </w:rPr>
-        <w:t xml:space="preserve">“</w:t>
+        <w:t xml:space="preserve">“Eğer hiç görmediğimiz yabancı bir hastanenin röntgenleri bozuk JPEG değil de, eğitimdeki gibi kayıpsız 12-bit </w:t>
       </w:r>
       <w:r>
         <w:rPr>
           <w:iCs/>
           <w:i/>
-        </w:rPr>
-        <w:t xml:space="preserve">Eğer hiç görmediğimiz yabancı bir hastanenin röntgenleri</w:t>
+          <w:rStyle w:val="VerbatimChar"/>
+        </w:rPr>
+        <w:t xml:space="preserve">.mha</w:t>
       </w:r>
       <w:r>
         <w:rPr>
           <w:iCs/>
           <w:i/>
         </w:rPr>
-        <w:t xml:space="preserve"> </w:t>
-      </w:r>
-      <w:r>
-        <w:rPr>
-          <w:iCs/>
-          <w:i/>
-        </w:rPr>
-        <w:t xml:space="preserve">bozuk JPEG değil de, eğitimdeki gibi kayıpsız 12-bit</w:t>
-      </w:r>
-      <w:r>
-        <w:rPr>
-          <w:iCs/>
-          <w:i/>
-        </w:rPr>
-        <w:t xml:space="preserve"> </w:t>
+        <w:t xml:space="preserve"> kalitesinde olsaydı ne olurdu?”</w:t>
+      </w:r>
+      <w:r>
+        <w:t xml:space="preserve"> NODE21 veri setinde Japonya’dan (JSRT) gelen </w:t>
+      </w:r>
+      <w:r>
+        <w:rPr>
+          <w:bCs/>
+          <w:b/>
+        </w:rPr>
+        <w:t xml:space="preserve">149 nodüllü hasta</w:t>
+      </w:r>
+      <w:r>
+        <w:t xml:space="preserve"> ayrı etiketlenmiş, ancak JSRT’nin </w:t>
+      </w:r>
+      <w:r>
+        <w:rPr>
+          <w:bCs/>
+          <w:b/>
+        </w:rPr>
+        <w:t xml:space="preserve">93 sağlıklı kontrol röntgeni</w:t>
+      </w:r>
+      <w:r>
+        <w:t xml:space="preserve"> diğer hastanelerin sağlıklılarıyla birlikte ortak kontrol havuzuna karıştırılmıştı. Ham </w:t>
       </w:r>
       <w:r>
         <w:rPr>
           <w:rStyle w:val="VerbatimChar"/>
-          <w:iCs/>
-          <w:i/>
         </w:rPr>
         <w:t xml:space="preserve">.mha</w:t>
       </w:r>
       <w:r>
-        <w:rPr>
-          <w:iCs/>
-          <w:i/>
-        </w:rPr>
-        <w:t xml:space="preserve"> </w:t>
-      </w:r>
-      <w:r>
-        <w:rPr>
-          <w:iCs/>
-          <w:i/>
-        </w:rPr>
-        <w:t xml:space="preserve">kalitesinde olsaydı ne olurdu?</w:t>
-      </w:r>
-      <w:r>
-        <w:rPr>
-          <w:iCs/>
-          <w:i/>
-        </w:rPr>
+        <w:t xml:space="preserve"> görüntü başlıklarındaki JSRT’ye özgü fiziksel imzayı (2048×2048 çözünürlük ve 0,175 mm/px piksel aralığı) tarayarak bu </w:t>
+      </w:r>
+      <w:r>
+        <w:rPr>
+          <w:bCs/>
+          <w:b/>
+        </w:rPr>
+        <w:t xml:space="preserve">93 orijinal sağlıklı Japon röntgenini</w:t>
+      </w:r>
+      <w:r>
+        <w:t xml:space="preserve"> eksiksiz tespit ettik. Ardından ana mimarimize hiç dokunmadan, eğitim ve doğrulama kümesinden </w:t>
+      </w:r>
+      <w:r>
+        <w:rPr>
+          <w:bCs/>
+          <w:b/>
+        </w:rPr>
+        <w:t xml:space="preserve">hem 149 JSRT nodüllü hem de 93 JSRT sağlıklı röntgenin tamamını çıkardık</w:t>
+      </w:r>
+      <w:r>
+        <w:t xml:space="preserve"> (eğitimde 0 JSRT pozitif, 0 JSRT negatif kaldı; 1. aşamadaki hazır ResNet50 gövdesi de ön-eğitiminde JSRT’yi hiç görmemişti) ve tamamen JSRT-siz bir modeli sıfırdan eğittik.</w:t>
+      </w:r>
+    </w:p>
+    <w:p>
+      <w:pPr>
+        <w:pStyle w:val="BodyText"/>
+      </w:pPr>
+      <w:r>
+        <w:t xml:space="preserve">Sonuç tam düşündüğümüz gibi çıktı: Görüntü kalitesi kayıpsız 12-bit </w:t>
+      </w:r>
+      <w:r>
+        <w:rPr>
+          <w:rStyle w:val="VerbatimChar"/>
+        </w:rPr>
+        <w:t xml:space="preserve">.mha</w:t>
+      </w:r>
+      <w:r>
+        <w:t xml:space="preserve"> olduğunda, model hayatında hiç görmediği </w:t>
+      </w:r>
+      <w:r>
+        <w:rPr>
+          <w:bCs/>
+          <w:b/>
+        </w:rPr>
+        <w:t xml:space="preserve">242 hastalık saf Japonya (149 nodüllü + 93 sağlıklı)</w:t>
+      </w:r>
+      <w:r>
+        <w:t xml:space="preserve"> kohortunda </w:t>
+      </w:r>
+      <w:r>
+        <w:rPr>
+          <w:bCs/>
+          <w:b/>
+        </w:rPr>
+        <w:t xml:space="preserve">hiç kalibrasyon yapmadan (sıfır-eğitimle)</w:t>
+      </w:r>
+      <w:r>
+        <w:t xml:space="preserve"> ilk 10 kutuda nodüllerin </w:t>
+      </w:r>
+      <w:r>
+        <w:rPr>
+          <w:bCs/>
+          <w:b/>
+        </w:rPr>
+        <w:t xml:space="preserve">%86,6’sını</w:t>
+      </w:r>
+      <w:r>
+        <w:t xml:space="preserve">, ilk 50 kutuda </w:t>
+      </w:r>
+      <w:r>
+        <w:rPr>
+          <w:bCs/>
+          <w:b/>
+        </w:rPr>
+        <w:t xml:space="preserve">%95,3’ünü (142/149)</w:t>
+      </w:r>
+      <w:r>
+        <w:t xml:space="preserve"> yakaladı; </w:t>
+      </w:r>
+      <w:r>
+        <w:rPr>
+          <w:bCs/>
+          <w:b/>
+        </w:rPr>
+        <w:t xml:space="preserve">0,920 (Top-1) / 0,965 (Noisy-OR) hasta AUC</w:t>
+      </w:r>
+      <w:r>
+        <w:t xml:space="preserve"> ile </w:t>
+      </w:r>
+      <w:r>
+        <w:rPr>
+          <w:bCs/>
+          <w:b/>
+        </w:rPr>
+        <w:t xml:space="preserve">%52,4 S@0.25</w:t>
+      </w:r>
+      <w:r>
+        <w:t xml:space="preserve"> ve </w:t>
+      </w:r>
+      <w:r>
+        <w:rPr>
+          <w:bCs/>
+          <w:b/>
+        </w:rPr>
+        <w:t xml:space="preserve">%58,4 S@0.50</w:t>
+      </w:r>
+      <w:r>
+        <w:t xml:space="preserve"> kutu isabetine ulaştı. Daha da çarpıcı olan şudur: yabancı hastane arka planında 1. aşama tarayıcı model tek başına </w:t>
+      </w:r>
+      <w:r>
+        <w:rPr>
+          <w:bCs/>
+          <w:b/>
+        </w:rPr>
+        <w:t xml:space="preserve">0,849 AUC</w:t>
+      </w:r>
+      <w:r>
+        <w:t xml:space="preserve"> ve </w:t>
+      </w:r>
+      <w:r>
+        <w:rPr>
+          <w:bCs/>
+          <w:b/>
+        </w:rPr>
+        <w:t xml:space="preserve">%49,7 S@0.25</w:t>
+      </w:r>
+      <w:r>
+        <w:t xml:space="preserve"> düzeyinde kalırken, </w:t>
+      </w:r>
+      <w:r>
+        <w:rPr>
+          <w:bCs/>
+          <w:b/>
+        </w:rPr>
+        <w:t xml:space="preserve">yalnız 2. aşama Lokal TDA modeli tek başına 0,970 Top-1 (0,979 Noisy-OR) hasta AUC</w:t>
+      </w:r>
+      <w:r>
+        <w:t xml:space="preserve"> üretmektedir. İki aşama birleştiğinde TDA katmanı hasta ayrımını </w:t>
+      </w:r>
+      <w:r>
+        <w:rPr>
+          <w:bCs/>
+          <w:b/>
+        </w:rPr>
+        <w:t xml:space="preserve">0,849 → 0,920 (+7,1 puan)</w:t>
+      </w:r>
+      <w:r>
+        <w:t xml:space="preserve"> ve S@0.25 kutu isabetini </w:t>
+      </w:r>
+      <w:r>
+        <w:rPr>
+          <w:bCs/>
+          <w:b/>
+        </w:rPr>
+        <w:t xml:space="preserve">%49,7 → %52,4 (+2,7 puan)</w:t>
+      </w:r>
+      <w:r>
+        <w:t xml:space="preserve"> seviyesine taşımaktadır. Üstelik hiçbir modelin eğitimde görmediği 74 hastalık (val+test: 42 nodüllü + 32 sağlıklı) saf JSRT alt kümesinde de JSRT’yi hiç görmeyen model (</w:t>
+      </w:r>
+      <w:r>
+        <w:rPr>
+          <w:bCs/>
+          <w:b/>
+        </w:rPr>
+        <w:t xml:space="preserve">0,908 AUC</w:t>
+      </w:r>
+      <w:r>
+        <w:t xml:space="preserve">) ile JSRT’den örnekler gören ana model (</w:t>
+      </w:r>
+      <w:r>
+        <w:rPr>
+          <w:bCs/>
+          <w:b/>
+        </w:rPr>
+        <w:t xml:space="preserve">0,901 AUC</w:t>
+      </w:r>
+      <w:r>
+        <w:t xml:space="preserve">) aynı başarıyı göstermektedir; yani topolojik şekil özetimiz yüksek kaliteli röntgenlerde hastaneden hastaneye kayıpsız taşınmaktadır.</w:t>
+      </w:r>
+    </w:p>
+    <w:p>
+      <w:pPr>
+        <w:pStyle w:val="BodyText"/>
+      </w:pPr>
+      <w:r>
+        <w:rPr>
+          <w:bCs/>
+          <w:b/>
+        </w:rPr>
+        <w:t xml:space="preserve">2. Düşük Kaliteli Hastane Verisinde Saha Kalibrasyonu (Çift-katmanlı uyarlama).</w:t>
+      </w:r>
+      <w:r>
+        <w:t xml:space="preserve"> </w:t>
+      </w:r>
+      <w:r>
+        <w:t xml:space="preserve">Peki görüntü kalitesinin düşük olduğu (8-bit JPEG Vietnam verisi gibi) bir hastaneye sistem</w:t>
+      </w:r>
+      <w:r>
+        <w:t xml:space="preserve"> </w:t>
+      </w:r>
+      <w:r>
+        <w:t xml:space="preserve">kurulduğunda ne yapılmalı? Bunu test ettiğimizde; sadece 2. aşamayı yerel örneklerle kalibre</w:t>
+      </w:r>
+      <w:r>
+        <w:t xml:space="preserve"> </w:t>
+      </w:r>
+      <w:r>
+        <w:t xml:space="preserve">etmenin skoru</w:t>
+      </w:r>
+      <w:r>
+        <w:t xml:space="preserve"> </w:t>
+      </w:r>
+      <w:r>
+        <w:rPr>
+          <w:rStyle w:val="VerbatimChar"/>
+        </w:rPr>
+        <w:t xml:space="preserve">0,69</w:t>
+      </w:r>
+      <w:r>
+        <w:t xml:space="preserve">’a, sadece 1. aşama başlığını ince ayarlamanın ise</w:t>
+      </w:r>
+      <w:r>
+        <w:t xml:space="preserve"> </w:t>
+      </w:r>
+      <w:r>
+        <w:rPr>
+          <w:rStyle w:val="VerbatimChar"/>
+        </w:rPr>
+        <w:t xml:space="preserve">0,72</w:t>
+      </w:r>
+      <w:r>
+        <w:t xml:space="preserve">’ye taşıyabildiğini</w:t>
+      </w:r>
+      <w:r>
+        <w:t xml:space="preserve"> </w:t>
+      </w:r>
+      <w:r>
+        <w:t xml:space="preserve">gördük. Ancak</w:t>
+      </w:r>
+      <w:r>
+        <w:t xml:space="preserve"> </w:t>
+      </w:r>
+      <w:r>
+        <w:rPr>
+          <w:bCs/>
+          <w:b/>
+        </w:rPr>
+        <w:t xml:space="preserve">her iki aşamayı birlikte</w:t>
+      </w:r>
+      <w:r>
+        <w:t xml:space="preserve"> </w:t>
+      </w:r>
+      <w:r>
+        <w:t xml:space="preserve">kalibre ettiğimizde güçlü bir tamamlayıcılıkla</w:t>
+      </w:r>
+      <w:r>
+        <w:t xml:space="preserve"> </w:t>
+      </w:r>
+      <w:r>
+        <w:rPr>
+          <w:rStyle w:val="VerbatimChar"/>
+          <w:bCs/>
+          <w:b/>
+        </w:rPr>
+        <w:t xml:space="preserve">0,794 AUC</w:t>
+      </w:r>
+      <w:r>
+        <w:t xml:space="preserve"> </w:t>
+      </w:r>
+      <w:r>
+        <w:t xml:space="preserve">değerine ulaştık. Bu da sistemin düşük kaliteli cihazlara sahip bir hastanede bile</w:t>
+      </w:r>
+      <w:r>
+        <w:t xml:space="preserve"> </w:t>
+      </w:r>
+      <w:r>
+        <w:t xml:space="preserve">az sayıda yerel örnekle hızla toparlanabildiğini gösteriyor.</w:t>
+      </w:r>
+    </w:p>
+    <w:p>
+      <w:pPr>
+        <w:pStyle w:val="BodyText"/>
+      </w:pPr>
+      <w:r>
+        <w:rPr>
+          <w:bCs/>
+          <w:b/>
+        </w:rPr>
+        <w:t xml:space="preserve">3. Ön-eğitim veri örtüşmesi skoru şişiriyor mu?</w:t>
+      </w:r>
+      <w:r>
+        <w:t xml:space="preserve"> </w:t>
+      </w:r>
+      <w:r>
+        <w:t xml:space="preserve">NODE21 veri seti açık kaynaklı röntgenlerden derlendiği için, 1. aşamada kullandığımız hazır</w:t>
+      </w:r>
+      <w:r>
+        <w:t xml:space="preserve"> </w:t>
+      </w:r>
+      <w:r>
+        <w:t xml:space="preserve">ResNet50 gövdesi pozitif vakaların bir kısmını (NIH ve PadChest) ön-eğitim sırasında (kutu etiketi</w:t>
+      </w:r>
+      <w:r>
+        <w:t xml:space="preserve"> </w:t>
+      </w:r>
+      <w:r>
+        <w:t xml:space="preserve">olmadan) görmüştü.</w:t>
+      </w:r>
+      <w:r>
+        <w:t xml:space="preserve"> </w:t>
+      </w:r>
+      <w:r>
+        <w:t xml:space="preserve">“</w:t>
+      </w:r>
+      <w:r>
+        <w:t xml:space="preserve">Acaba başarımız bu yüzden mi yüksek?</w:t>
+      </w:r>
+      <w:r>
         <w:t xml:space="preserve">”</w:t>
       </w:r>
       <w:r>
         <w:t xml:space="preserve"> </w:t>
       </w:r>
       <w:r>
-        <w:t xml:space="preserve">Bunu ölçmek için NODE21 içindeki 4 alt kaynaktan biri olan</w:t>
-      </w:r>
-      <w:r>
-        <w:t xml:space="preserve"> </w:t>
-      </w:r>
-      <w:r>
-        <w:rPr>
-          <w:bCs/>
-          <w:b/>
-        </w:rPr>
-        <w:t xml:space="preserve">Japonya (JSRT: 149 nodüllü + .mha başlık imzasıyla tespit edilen 93 orijinal sağlıklı kontrol = 242 hasta)</w:t>
-      </w:r>
-      <w:r>
-        <w:t xml:space="preserve"> </w:t>
-      </w:r>
-      <w:r>
-        <w:t xml:space="preserve">veri</w:t>
-      </w:r>
-      <w:r>
-        <w:t xml:space="preserve"> </w:t>
-      </w:r>
-      <w:r>
-        <w:t xml:space="preserve">setini eğitimden</w:t>
-      </w:r>
-      <w:r>
-        <w:t xml:space="preserve"> </w:t>
-      </w:r>
-      <w:r>
-        <w:rPr>
-          <w:bCs/>
-          <w:b/>
-        </w:rPr>
-        <w:t xml:space="preserve">tamamen çıkardık</w:t>
-      </w:r>
-      <w:r>
-        <w:t xml:space="preserve"> </w:t>
-      </w:r>
-      <w:r>
-        <w:t xml:space="preserve">(zaten 1. aşamadaki hazır ResNet50 gövdesi de ön-eğitiminde</w:t>
-      </w:r>
-      <w:r>
-        <w:t xml:space="preserve"> </w:t>
-      </w:r>
-      <w:r>
-        <w:t xml:space="preserve">JSRT’yi hiç görmemişti) ve ana mimariye hiç dokunmadan izole bir modeli sıfırdan eğittik. Sonuç tam</w:t>
-      </w:r>
-      <w:r>
-        <w:t xml:space="preserve"> </w:t>
-      </w:r>
-      <w:r>
-        <w:t xml:space="preserve">düşündüğümüz gibi çıktı: Görüntü kalitesi kayıpsız 12-bit</w:t>
-      </w:r>
-      <w:r>
-        <w:t xml:space="preserve"> </w:t>
-      </w:r>
-      <w:r>
-        <w:rPr>
-          <w:rStyle w:val="VerbatimChar"/>
-        </w:rPr>
-        <w:t xml:space="preserve">.mha</w:t>
-      </w:r>
-      <w:r>
-        <w:t xml:space="preserve"> </w:t>
-      </w:r>
-      <w:r>
-        <w:t xml:space="preserve">olduğunda, model hayatında hiç</w:t>
-      </w:r>
-      <w:r>
-        <w:t xml:space="preserve"> </w:t>
-      </w:r>
-      <w:r>
-        <w:t xml:space="preserve">görmediği Japonya hastanesinde</w:t>
-      </w:r>
-      <w:r>
-        <w:t xml:space="preserve"> </w:t>
-      </w:r>
-      <w:r>
-        <w:rPr>
-          <w:bCs/>
-          <w:b/>
-        </w:rPr>
-        <w:t xml:space="preserve">hiç kalibrasyon yapmadan (sıfır-eğitimle)</w:t>
-      </w:r>
-      <w:r>
-        <w:t xml:space="preserve"> </w:t>
-      </w:r>
-      <w:r>
-        <w:t xml:space="preserve">ilk 50 kutuda</w:t>
-      </w:r>
-      <w:r>
-        <w:t xml:space="preserve"> </w:t>
-      </w:r>
-      <w:r>
-        <w:t xml:space="preserve">nodüllerin</w:t>
-      </w:r>
-      <w:r>
-        <w:t xml:space="preserve"> </w:t>
-      </w:r>
-      <w:r>
-        <w:rPr>
-          <w:bCs/>
-          <w:b/>
-        </w:rPr>
-        <w:t xml:space="preserve">%95,3’ünü (ilk 10 kutuda %86,6)</w:t>
-      </w:r>
-      <w:r>
-        <w:t xml:space="preserve"> </w:t>
-      </w:r>
-      <w:r>
-        <w:t xml:space="preserve">yakaladı ve</w:t>
-      </w:r>
-      <w:r>
-        <w:t xml:space="preserve"> </w:t>
-      </w:r>
-      <w:r>
-        <w:rPr>
-          <w:bCs/>
-          <w:b/>
-        </w:rPr>
-        <w:t>0,920 (Top-1) / 0,965 (Noisy-OR) hasta AUC ile %52,4 S@0.25 ve %58,4 S@0.50 kutu duyarlılığına ulaştı (eğitim ve kalibrasyon kümesinde 0 JSRT pozitif, 0 JSRT negatif).</w:t>
-      </w:r>
-      <w:r/>
-      <w:r/>
-      <w:r/>
-      <w:r>
-        <w:t xml:space="preserve"> Daha da önemlisi, yalnız 2. aşama Lokal TDA puanına bakıldığında JSRT’yi hiç görmeyen model</w:t>
-      </w:r>
-      <w:r>
-        <w:t xml:space="preserve"> </w:t>
-      </w:r>
-      <w:r>
-        <w:rPr>
-          <w:bCs/>
-          <w:b/>
-        </w:rPr>
-        <w:t xml:space="preserve">0,970 Top-1 (0,979 Noisy-OR) AUC</w:t>
-      </w:r>
-      <w:r>
-        <w:t xml:space="preserve">, JSRT’yi gören ana model</w:t>
-      </w:r>
-      <w:r>
-        <w:t xml:space="preserve"> </w:t>
-      </w:r>
-      <w:r>
-        <w:rPr>
-          <w:bCs/>
-          <w:b/>
-        </w:rPr>
-        <w:t xml:space="preserve">0,958 Top-1 (0,981 Noisy-OR) AUC</w:t>
-      </w:r>
-      <w:r>
-        <w:t xml:space="preserve"> </w:t>
-      </w:r>
-      <w:r>
-        <w:t xml:space="preserve">veriyor; 242 saf JSRT hastasında 1. aşama tek başına 0,849 AUC ve %49,7 S@0.25’te kalırken 2. aşama topolojik katman birleşimde başarıyı 0,849 → 0,920 (+7,1 puan) AUC ve %52,4 S@0.25 düzeyine taşıyor (74 hastalık val+test alt kümesinde de JSRT’yi hiç görmeyen model 0,908 AUC ile ana modelin 0,901 AUC skorunu yakalıyor; yani kaynak ezberi olmadan, topolojik şekil özetimiz yüksek kaliteli röntgenlerde hastaneden hastaneye kayıpsız taşınmaktadır).</w:t>
+        <w:t xml:space="preserve">şüphesiyle modeli hiç röntgen görmemiş bir</w:t>
+      </w:r>
+      <w:r>
+        <w:t xml:space="preserve"> </w:t>
+      </w:r>
+      <w:r>
+        <w:t xml:space="preserve">ImageNet gövdesiyle kıyasladık. Sonuç tam tersini gösterdi: Hazır gövdenin asıl büyük faydası, daha</w:t>
+      </w:r>
+      <w:r>
+        <w:t xml:space="preserve"> </w:t>
+      </w:r>
+      <w:r>
+        <w:t xml:space="preserve">önce gördüğü kaynaklarda değil,</w:t>
+      </w:r>
+      <w:r>
+        <w:t xml:space="preserve"> </w:t>
+      </w:r>
+      <w:r>
+        <w:rPr>
+          <w:bCs/>
+          <w:b/>
+        </w:rPr>
+        <w:t xml:space="preserve">hayatında hiç görmediği</w:t>
+      </w:r>
+      <w:r>
+        <w:t xml:space="preserve"> </w:t>
+      </w:r>
+      <w:r>
+        <w:t xml:space="preserve">kaynaklarda (</w:t>
+      </w:r>
+      <w:r>
+        <w:rPr>
+          <w:bCs/>
+          <w:b/>
+        </w:rPr>
+        <w:t xml:space="preserve">+0,325 AUC</w:t>
+      </w:r>
+      <w:r>
+        <w:t xml:space="preserve"> </w:t>
+      </w:r>
+      <w:r>
+        <w:t xml:space="preserve">sağlamlaştırma etkisiyle) ortaya çıktı.</w:t>
       </w:r>
     </w:p>
     <w:p>
@@ -2877,194 +3086,6 @@
           <w:bCs/>
           <w:b/>
         </w:rPr>
-        <w:t xml:space="preserve">2. Düşük Kaliteli Hastane Verisinde Saha Kalibrasyonu (Çift-katmanlı uyarlama).</w:t>
-      </w:r>
-      <w:r>
-        <w:t xml:space="preserve"> </w:t>
-      </w:r>
-      <w:r>
-        <w:t xml:space="preserve">Peki görüntü kalitesinin düşük olduğu (8-bit JPEG Vietnam verisi gibi) bir hastaneye sistem</w:t>
-      </w:r>
-      <w:r>
-        <w:t xml:space="preserve"> </w:t>
-      </w:r>
-      <w:r>
-        <w:t xml:space="preserve">kurulduğunda ne yapılmalı? Bunu test ettiğimizde; sadece 2. aşamayı yerel örneklerle kalibre</w:t>
-      </w:r>
-      <w:r>
-        <w:t xml:space="preserve"> </w:t>
-      </w:r>
-      <w:r>
-        <w:t xml:space="preserve">etmenin skoru</w:t>
-      </w:r>
-      <w:r>
-        <w:t xml:space="preserve"> </w:t>
-      </w:r>
-      <w:r>
-        <w:rPr>
-          <w:rStyle w:val="VerbatimChar"/>
-        </w:rPr>
-        <w:t xml:space="preserve">0,69</w:t>
-      </w:r>
-      <w:r>
-        <w:t xml:space="preserve">’a, sadece 1. aşama başlığını ince ayarlamanın ise</w:t>
-      </w:r>
-      <w:r>
-        <w:t xml:space="preserve"> </w:t>
-      </w:r>
-      <w:r>
-        <w:rPr>
-          <w:rStyle w:val="VerbatimChar"/>
-        </w:rPr>
-        <w:t xml:space="preserve">0,72</w:t>
-      </w:r>
-      <w:r>
-        <w:t xml:space="preserve">’ye taşıyabildiğini</w:t>
-      </w:r>
-      <w:r>
-        <w:t xml:space="preserve"> </w:t>
-      </w:r>
-      <w:r>
-        <w:t xml:space="preserve">gördük. Ancak</w:t>
-      </w:r>
-      <w:r>
-        <w:t xml:space="preserve"> </w:t>
-      </w:r>
-      <w:r>
-        <w:rPr>
-          <w:bCs/>
-          <w:b/>
-        </w:rPr>
-        <w:t xml:space="preserve">her iki aşamayı birlikte</w:t>
-      </w:r>
-      <w:r>
-        <w:t xml:space="preserve"> </w:t>
-      </w:r>
-      <w:r>
-        <w:t xml:space="preserve">kalibre ettiğimizde güçlü bir tamamlayıcılıkla</w:t>
-      </w:r>
-      <w:r>
-        <w:t xml:space="preserve"> </w:t>
-      </w:r>
-      <w:r>
-        <w:rPr>
-          <w:rStyle w:val="VerbatimChar"/>
-          <w:bCs/>
-          <w:b/>
-        </w:rPr>
-        <w:t xml:space="preserve">0,794 AUC</w:t>
-      </w:r>
-      <w:r>
-        <w:t xml:space="preserve"> </w:t>
-      </w:r>
-      <w:r>
-        <w:t xml:space="preserve">değerine ulaştık. Bu da sistemin düşük kaliteli cihazlara sahip bir hastanede bile</w:t>
-      </w:r>
-      <w:r>
-        <w:t xml:space="preserve"> </w:t>
-      </w:r>
-      <w:r>
-        <w:t xml:space="preserve">az sayıda yerel örnekle hızla toparlanabildiğini gösteriyor.</w:t>
-      </w:r>
-    </w:p>
-    <w:p>
-      <w:pPr>
-        <w:pStyle w:val="BodyText"/>
-      </w:pPr>
-      <w:r>
-        <w:rPr>
-          <w:bCs/>
-          <w:b/>
-        </w:rPr>
-        <w:t xml:space="preserve">3. Ön-eğitim veri örtüşmesi skoru şişiriyor mu?</w:t>
-      </w:r>
-      <w:r>
-        <w:t xml:space="preserve"> </w:t>
-      </w:r>
-      <w:r>
-        <w:t xml:space="preserve">NODE21 veri seti açık kaynaklı röntgenlerden derlendiği için, 1. aşamada kullandığımız hazır</w:t>
-      </w:r>
-      <w:r>
-        <w:t xml:space="preserve"> </w:t>
-      </w:r>
-      <w:r>
-        <w:t xml:space="preserve">ResNet50 gövdesi pozitif vakaların bir kısmını (NIH ve PadChest) ön-eğitim sırasında (kutu etiketi</w:t>
-      </w:r>
-      <w:r>
-        <w:t xml:space="preserve"> </w:t>
-      </w:r>
-      <w:r>
-        <w:t xml:space="preserve">olmadan) görmüştü.</w:t>
-      </w:r>
-      <w:r>
-        <w:t xml:space="preserve"> </w:t>
-      </w:r>
-      <w:r>
-        <w:t xml:space="preserve">“</w:t>
-      </w:r>
-      <w:r>
-        <w:t xml:space="preserve">Acaba başarımız bu yüzden mi yüksek?</w:t>
-      </w:r>
-      <w:r>
-        <w:t xml:space="preserve">”</w:t>
-      </w:r>
-      <w:r>
-        <w:t xml:space="preserve"> </w:t>
-      </w:r>
-      <w:r>
-        <w:t xml:space="preserve">şüphesiyle modeli hiç röntgen görmemiş bir</w:t>
-      </w:r>
-      <w:r>
-        <w:t xml:space="preserve"> </w:t>
-      </w:r>
-      <w:r>
-        <w:t xml:space="preserve">ImageNet gövdesiyle kıyasladık. Sonuç tam tersini gösterdi: Hazır gövdenin asıl büyük faydası, daha</w:t>
-      </w:r>
-      <w:r>
-        <w:t xml:space="preserve"> </w:t>
-      </w:r>
-      <w:r>
-        <w:t xml:space="preserve">önce gördüğü kaynaklarda değil,</w:t>
-      </w:r>
-      <w:r>
-        <w:t xml:space="preserve"> </w:t>
-      </w:r>
-      <w:r>
-        <w:rPr>
-          <w:bCs/>
-          <w:b/>
-        </w:rPr>
-        <w:t xml:space="preserve">hayatında hiç görmediği</w:t>
-      </w:r>
-      <w:r>
-        <w:t xml:space="preserve"> </w:t>
-      </w:r>
-      <w:r>
-        <w:t xml:space="preserve">kaynaklarda (</w:t>
-      </w:r>
-      <w:r>
-        <w:rPr>
-          <w:bCs/>
-          <w:b/>
-        </w:rPr>
-        <w:t xml:space="preserve">+0,325 AUC</w:t>
-      </w:r>
-      <w:r>
-        <w:t xml:space="preserve"> </w:t>
-      </w:r>
-      <w:r>
-        <w:t xml:space="preserve">sağlamlaştırma etkisiyle) ortaya çıktı.</w:t>
-      </w:r>
-    </w:p>
-    <w:p>
-      <w:pPr>
-        <w:pStyle w:val="BodyText"/>
-      </w:pPr>
-      <w:r>
-        <w:rPr>
-          <w:bCs/>
-          <w:b/>
-        </w:rPr>
         <w:t xml:space="preserve">4. Dürüst sınırlılıklar.</w:t>
       </w:r>
       <w:r>
@@ -3113,7 +3134,7 @@
         <w:t xml:space="preserve">S@0.125</w:t>
       </w:r>
       <w:r>
-        <w:t xml:space="preserve">) küçük bir duyarlılık tavizi verebiliyor. Kutu boyutu konusunda</w:t>
+        <w:t xml:space="preserve">, yani 8 röntgende en fazla 1 yanlış alarma izin verildiğinde) küçük bir duyarlılık tavizi verebiliyor. Kutu boyutu konusunda</w:t>
       </w:r>
       <w:r>
         <w:t xml:space="preserve"> </w:t>

</xml_diff>